<commit_message>
packet: US spelling throughout (licenses, not licences)
Evan's preference, given 9/30. Corrected across the packet notes, the
90-day plan source and the generated Word files, and saved to memory so
it applies to everything written for him from here.
</commit_message>
<xml_diff>
--- a/Applications/2026-09-30 Microbac - Regional Lab Ops Director (Mid-Atlantic)/Evan Parnell - First 90 Days - Mid-Atlantic Region.docx
+++ b/Applications/2026-09-30 Microbac - Regional Lab Ops Director (Mid-Atlantic)/Evan Parnell - First 90 Days - Mid-Atlantic Region.docx
@@ -83,7 +83,7 @@
           <w:sz w:val="20"/>
           <w:szCs w:val="20"/>
         </w:rPr>
-        <w:t xml:space="preserve">A region of independently accredited laboratories with different scopes, licences and histories cannot be managed as one until its numbers mean the same thing at every site. </w:t>
+        <w:t xml:space="preserve">A region of independently accredited laboratories with different scopes, licenses and histories cannot be managed as one until its numbers mean the same thing at every site. </w:t>
       </w:r>
       <w:r>
         <w:rPr>
@@ -382,7 +382,7 @@
           <w:sz w:val="20"/>
           <w:szCs w:val="20"/>
         </w:rPr>
-        <w:t xml:space="preserve">Protect what works. Where a sub-region already performs, the cadence should confirm it and get out of the way. Technical authority stays with the technical leaders who hold the licences.</w:t>
+        <w:t xml:space="preserve">Protect what works. Where a sub-region already performs, the cadence should confirm it and get out of the way. Technical authority stays with the technical leaders who hold the licenses.</w:t>
       </w:r>
     </w:p>
     <w:p>

</xml_diff>

<commit_message>
90-day plan: rewritten in quality-assurance language, substance unchanged
Every element is the same; the dialect is now the one a laboratory
audience thinks in. The three phases are named for what they actually
are: Current-State Assessment, Gap Analysis and Harmonization, and
Corrective Action and Remediation Plan.

Key renamings: measure before changing becomes "observations only, no
corrective action until the data set is complete"; checking whether sites
define metrics the same way becomes verifying the measurement system
before trusting the measurements; fixing definitions before setting
targets becomes "specification before target," with the analogy that a
method is qualified before its results are trended; the visible win
becomes root cause, correction at one site, and a defined effectiveness
check; protecting what works becomes "protect what already conforms";
and the closing section becomes "controls I would hold myself to."

Still two pages.
</commit_message>
<xml_diff>
--- a/Applications/2026-09-30 Microbac - Regional Lab Ops Director (Mid-Atlantic)/Evan Parnell - First 90 Days - Mid-Atlantic Region.docx
+++ b/Applications/2026-09-30 Microbac - Regional Lab Ops Director (Mid-Atlantic)/Evan Parnell - First 90 Days - Mid-Atlantic Region.docx
@@ -50,7 +50,7 @@
           <w:sz w:val="18"/>
           <w:szCs w:val="18"/>
         </w:rPr>
-        <w:t xml:space="preserve">A working outline offered for discussion, not a finished plan — it should change once I can see the region’s actual numbers.</w:t>
+        <w:t xml:space="preserve">A working outline offered for discussion, not a finished plan — it should change once I can see the region’s actual data.</w:t>
       </w:r>
     </w:p>
     <w:p>
@@ -83,25 +83,25 @@
           <w:sz w:val="20"/>
           <w:szCs w:val="20"/>
         </w:rPr>
-        <w:t xml:space="preserve">A region of independently accredited laboratories with different scopes, licenses and histories cannot be managed as one until its numbers mean the same thing at every site. </w:t>
-      </w:r>
-      <w:r>
-        <w:rPr>
-          <w:rFonts w:ascii="Calibri" w:cs="Calibri" w:eastAsia="Calibri" w:hAnsi="Calibri"/>
-          <w:b/>
-          <w:bCs/>
-          <w:sz w:val="20"/>
-          <w:szCs w:val="20"/>
-        </w:rPr>
-        <w:t xml:space="preserve">Measurement first, standardization second, structure last.</w:t>
-      </w:r>
-      <w:r>
-        <w:rPr>
-          <w:rFonts w:ascii="Calibri" w:cs="Calibri" w:eastAsia="Calibri" w:hAnsi="Calibri"/>
-          <w:sz w:val="20"/>
-          <w:szCs w:val="20"/>
-        </w:rPr>
-        <w:t xml:space="preserve"> I would rather be deliberately slow for thirty days than reorganize something in week two that I do not yet understand.</w:t>
+        <w:t xml:space="preserve">A region of independently accredited laboratories, each with its own scope and its own state approvals, cannot be managed as one system until its data mean the same thing at every site. </w:t>
+      </w:r>
+      <w:r>
+        <w:rPr>
+          <w:rFonts w:ascii="Calibri" w:cs="Calibri" w:eastAsia="Calibri" w:hAnsi="Calibri"/>
+          <w:b/>
+          <w:bCs/>
+          <w:sz w:val="20"/>
+          <w:szCs w:val="20"/>
+        </w:rPr>
+        <w:t xml:space="preserve">Characterize first, harmonize second, restructure last.</w:t>
+      </w:r>
+      <w:r>
+        <w:rPr>
+          <w:rFonts w:ascii="Calibri" w:cs="Calibri" w:eastAsia="Calibri" w:hAnsi="Calibri"/>
+          <w:sz w:val="20"/>
+          <w:szCs w:val="20"/>
+        </w:rPr>
+        <w:t xml:space="preserve"> I would rather spend thirty days establishing a defensible baseline than take corrective action against a problem I have not yet confirmed.</w:t>
       </w:r>
     </w:p>
     <w:p>
@@ -121,125 +121,140 @@
           <w:sz w:val="21"/>
           <w:szCs w:val="21"/>
         </w:rPr>
-        <w:t xml:space="preserve">Days 1–30 · Listen and measure. Change almost nothing.</w:t>
-      </w:r>
-    </w:p>
-    <w:p>
-      <w:pPr>
-        <w:pStyle w:val="ListParagraph"/>
-        <w:numPr>
-          <w:ilvl w:val="0"/>
-          <w:numId w:val="2"/>
-        </w:numPr>
-        <w:spacing w:after="60"/>
-      </w:pPr>
-      <w:r>
-        <w:rPr>
-          <w:rFonts w:ascii="Calibri" w:cs="Calibri" w:eastAsia="Calibri" w:hAnsi="Calibri"/>
-          <w:sz w:val="20"/>
-          <w:szCs w:val="20"/>
-        </w:rPr>
-        <w:t xml:space="preserve">Visit every laboratory and service center in the region — time at the bench, not only in the office.</w:t>
-      </w:r>
-    </w:p>
-    <w:p>
-      <w:pPr>
-        <w:pStyle w:val="ListParagraph"/>
-        <w:numPr>
-          <w:ilvl w:val="0"/>
-          <w:numId w:val="2"/>
-        </w:numPr>
-        <w:spacing w:after="60"/>
-      </w:pPr>
-      <w:r>
-        <w:rPr>
-          <w:rFonts w:ascii="Calibri" w:cs="Calibri" w:eastAsia="Calibri" w:hAnsi="Calibri"/>
-          <w:sz w:val="20"/>
-          <w:szCs w:val="20"/>
-        </w:rPr>
-        <w:t xml:space="preserve">Sit with each site’s leadership, and separately with analysts and sample receiving. The people who receive samples and release data know where the losses are.</w:t>
-      </w:r>
-    </w:p>
-    <w:p>
-      <w:pPr>
-        <w:pStyle w:val="ListParagraph"/>
-        <w:numPr>
-          <w:ilvl w:val="0"/>
-          <w:numId w:val="2"/>
-        </w:numPr>
-        <w:spacing w:after="60"/>
-      </w:pPr>
-      <w:r>
-        <w:rPr>
-          <w:rFonts w:ascii="Calibri" w:cs="Calibri" w:eastAsia="Calibri" w:hAnsi="Calibri"/>
-          <w:sz w:val="20"/>
-          <w:szCs w:val="20"/>
-        </w:rPr>
-        <w:t xml:space="preserve">Pull twelve months by site: revenue and margin to plan, cost per sample, on-time turnaround, reanalysis and rework, overtime, instrument uptime, open corrective actions, accredited scope.</w:t>
-      </w:r>
-    </w:p>
-    <w:p>
-      <w:pPr>
-        <w:pStyle w:val="ListParagraph"/>
-        <w:numPr>
-          <w:ilvl w:val="0"/>
-          <w:numId w:val="2"/>
-        </w:numPr>
-        <w:spacing w:after="60"/>
-      </w:pPr>
-      <w:r>
-        <w:rPr>
-          <w:rFonts w:ascii="Calibri" w:cs="Calibri" w:eastAsia="Calibri" w:hAnsi="Calibri"/>
-          <w:b/>
-          <w:bCs/>
-          <w:sz w:val="20"/>
-          <w:szCs w:val="20"/>
-        </w:rPr>
-        <w:t xml:space="preserve">Determine whether every site defines those the same way.</w:t>
-      </w:r>
-      <w:r>
-        <w:rPr>
-          <w:rFonts w:ascii="Calibri" w:cs="Calibri" w:eastAsia="Calibri" w:hAnsi="Calibri"/>
-          <w:sz w:val="20"/>
-          <w:szCs w:val="20"/>
-        </w:rPr>
-        <w:t xml:space="preserve"> On-time turnaround especially — received-to-reported or scheduled-to-reported is where variance hides.</w:t>
-      </w:r>
-    </w:p>
-    <w:p>
-      <w:pPr>
-        <w:pStyle w:val="ListParagraph"/>
-        <w:numPr>
-          <w:ilvl w:val="0"/>
-          <w:numId w:val="2"/>
-        </w:numPr>
-        <w:spacing w:after="60"/>
-      </w:pPr>
-      <w:r>
-        <w:rPr>
-          <w:rFonts w:ascii="Calibri" w:cs="Calibri" w:eastAsia="Calibri" w:hAnsi="Calibri"/>
-          <w:sz w:val="20"/>
-          <w:szCs w:val="20"/>
-        </w:rPr>
-        <w:t xml:space="preserve">Map the region honestly: which sites are full-service laboratories, which are focused benches, which are service centers, and where each site’s accredited scope begins and ends.</w:t>
-      </w:r>
-    </w:p>
-    <w:p>
-      <w:pPr>
-        <w:pStyle w:val="ListParagraph"/>
-        <w:numPr>
-          <w:ilvl w:val="0"/>
-          <w:numId w:val="2"/>
-        </w:numPr>
-        <w:spacing w:after="60"/>
-      </w:pPr>
-      <w:r>
-        <w:rPr>
-          <w:rFonts w:ascii="Calibri" w:cs="Calibri" w:eastAsia="Calibri" w:hAnsi="Calibri"/>
-          <w:sz w:val="20"/>
-          <w:szCs w:val="20"/>
-        </w:rPr>
-        <w:t xml:space="preserve">Understand the top clients per site, and what each would say about us if I called them.</w:t>
+        <w:t xml:space="preserve">Phase I · Days 1–30 · Current-State Assessment</w:t>
+      </w:r>
+    </w:p>
+    <w:p>
+      <w:pPr>
+        <w:spacing w:after="80" w:before="0"/>
+      </w:pPr>
+      <w:r>
+        <w:rPr>
+          <w:rFonts w:ascii="Calibri" w:cs="Calibri" w:eastAsia="Calibri" w:hAnsi="Calibri"/>
+          <w:i/>
+          <w:iCs/>
+          <w:sz w:val="20"/>
+          <w:szCs w:val="20"/>
+        </w:rPr>
+        <w:t xml:space="preserve">Observations only. No corrective action until the data set is complete.</w:t>
+      </w:r>
+    </w:p>
+    <w:p>
+      <w:pPr>
+        <w:pStyle w:val="ListParagraph"/>
+        <w:numPr>
+          <w:ilvl w:val="0"/>
+          <w:numId w:val="2"/>
+        </w:numPr>
+        <w:spacing w:after="60"/>
+      </w:pPr>
+      <w:r>
+        <w:rPr>
+          <w:rFonts w:ascii="Calibri" w:cs="Calibri" w:eastAsia="Calibri" w:hAnsi="Calibri"/>
+          <w:sz w:val="20"/>
+          <w:szCs w:val="20"/>
+        </w:rPr>
+        <w:t xml:space="preserve">On-site assessment at every laboratory and service center in the region — time at the bench, not only in the office.</w:t>
+      </w:r>
+    </w:p>
+    <w:p>
+      <w:pPr>
+        <w:pStyle w:val="ListParagraph"/>
+        <w:numPr>
+          <w:ilvl w:val="0"/>
+          <w:numId w:val="2"/>
+        </w:numPr>
+        <w:spacing w:after="60"/>
+      </w:pPr>
+      <w:r>
+        <w:rPr>
+          <w:rFonts w:ascii="Calibri" w:cs="Calibri" w:eastAsia="Calibri" w:hAnsi="Calibri"/>
+          <w:sz w:val="20"/>
+          <w:szCs w:val="20"/>
+        </w:rPr>
+        <w:t xml:space="preserve">Interviews at three levels: laboratory and division management, technical and quality leadership, and the analysts and sample-receiving staff who see the failures first.</w:t>
+      </w:r>
+    </w:p>
+    <w:p>
+      <w:pPr>
+        <w:pStyle w:val="ListParagraph"/>
+        <w:numPr>
+          <w:ilvl w:val="0"/>
+          <w:numId w:val="2"/>
+        </w:numPr>
+        <w:spacing w:after="60"/>
+      </w:pPr>
+      <w:r>
+        <w:rPr>
+          <w:rFonts w:ascii="Calibri" w:cs="Calibri" w:eastAsia="Calibri" w:hAnsi="Calibri"/>
+          <w:sz w:val="20"/>
+          <w:szCs w:val="20"/>
+        </w:rPr>
+        <w:t xml:space="preserve">Retrospective review of twelve months by site: revenue and margin to plan, cost per sample, on-time turnaround, reanalysis and rework rate, overtime, instrument uptime, open corrective actions, accredited scope.</w:t>
+      </w:r>
+    </w:p>
+    <w:p>
+      <w:pPr>
+        <w:pStyle w:val="ListParagraph"/>
+        <w:numPr>
+          <w:ilvl w:val="0"/>
+          <w:numId w:val="2"/>
+        </w:numPr>
+        <w:spacing w:after="60"/>
+      </w:pPr>
+      <w:r>
+        <w:rPr>
+          <w:rFonts w:ascii="Calibri" w:cs="Calibri" w:eastAsia="Calibri" w:hAnsi="Calibri"/>
+          <w:b/>
+          <w:bCs/>
+          <w:sz w:val="20"/>
+          <w:szCs w:val="20"/>
+        </w:rPr>
+        <w:t xml:space="preserve">Verify the measurement system before trusting the measurements.</w:t>
+      </w:r>
+      <w:r>
+        <w:rPr>
+          <w:rFonts w:ascii="Calibri" w:cs="Calibri" w:eastAsia="Calibri" w:hAnsi="Calibri"/>
+          <w:sz w:val="20"/>
+          <w:szCs w:val="20"/>
+        </w:rPr>
+        <w:t xml:space="preserve"> Confirm every site calculates those the same way. Turnaround especially — received-to-reported versus scheduled-to-reported is where the variance hides.</w:t>
+      </w:r>
+    </w:p>
+    <w:p>
+      <w:pPr>
+        <w:pStyle w:val="ListParagraph"/>
+        <w:numPr>
+          <w:ilvl w:val="0"/>
+          <w:numId w:val="2"/>
+        </w:numPr>
+        <w:spacing w:after="60"/>
+      </w:pPr>
+      <w:r>
+        <w:rPr>
+          <w:rFonts w:ascii="Calibri" w:cs="Calibri" w:eastAsia="Calibri" w:hAnsi="Calibri"/>
+          <w:sz w:val="20"/>
+          <w:szCs w:val="20"/>
+        </w:rPr>
+        <w:t xml:space="preserve">Map the network as it actually is: which sites are full-service laboratories, which are focused benches, which are service centers, and where each site’s accredited scope begins and ends.</w:t>
+      </w:r>
+    </w:p>
+    <w:p>
+      <w:pPr>
+        <w:pStyle w:val="ListParagraph"/>
+        <w:numPr>
+          <w:ilvl w:val="0"/>
+          <w:numId w:val="2"/>
+        </w:numPr>
+        <w:spacing w:after="60"/>
+      </w:pPr>
+      <w:r>
+        <w:rPr>
+          <w:rFonts w:ascii="Calibri" w:cs="Calibri" w:eastAsia="Calibri" w:hAnsi="Calibri"/>
+          <w:sz w:val="20"/>
+          <w:szCs w:val="20"/>
+        </w:rPr>
+        <w:t xml:space="preserve">Client view: the top accounts at each site, and what each would say about us if I called them.</w:t>
       </w:r>
     </w:p>
     <w:p>
@@ -262,7 +277,7 @@
           <w:sz w:val="20"/>
           <w:szCs w:val="20"/>
         </w:rPr>
-        <w:t xml:space="preserve">a written baseline of the region as it actually is, including where our numbers are not yet comparable.</w:t>
+        <w:t xml:space="preserve">a written baseline of the region as it is — with anything not yet verifiable identified as such rather than assumed.</w:t>
       </w:r>
     </w:p>
     <w:p>
@@ -282,107 +297,135 @@
           <w:sz w:val="21"/>
           <w:szCs w:val="21"/>
         </w:rPr>
-        <w:t xml:space="preserve">Days 31–60 · Install one operating cadence.</w:t>
-      </w:r>
-    </w:p>
-    <w:p>
-      <w:pPr>
-        <w:pStyle w:val="ListParagraph"/>
-        <w:numPr>
-          <w:ilvl w:val="0"/>
-          <w:numId w:val="2"/>
-        </w:numPr>
-        <w:spacing w:after="60"/>
-      </w:pPr>
-      <w:r>
-        <w:rPr>
-          <w:rFonts w:ascii="Calibri" w:cs="Calibri" w:eastAsia="Calibri" w:hAnsi="Calibri"/>
-          <w:sz w:val="20"/>
-          <w:szCs w:val="20"/>
-        </w:rPr>
-        <w:t xml:space="preserve">One weekly metric set, defined identically everywhere, small enough that site leaders can produce it without a project: backlog and aging, on-time turnaround, open corrective actions, overtime.</w:t>
-      </w:r>
-    </w:p>
-    <w:p>
-      <w:pPr>
-        <w:pStyle w:val="ListParagraph"/>
-        <w:numPr>
-          <w:ilvl w:val="0"/>
-          <w:numId w:val="2"/>
-        </w:numPr>
-        <w:spacing w:after="60"/>
-      </w:pPr>
-      <w:r>
-        <w:rPr>
-          <w:rFonts w:ascii="Calibri" w:cs="Calibri" w:eastAsia="Calibri" w:hAnsi="Calibri"/>
-          <w:sz w:val="20"/>
-          <w:szCs w:val="20"/>
-        </w:rPr>
-        <w:t xml:space="preserve">One monthly operating review per site, same agenda: performance to plan, capacity, quality, people.</w:t>
-      </w:r>
-    </w:p>
-    <w:p>
-      <w:pPr>
-        <w:pStyle w:val="ListParagraph"/>
-        <w:numPr>
-          <w:ilvl w:val="0"/>
-          <w:numId w:val="2"/>
-        </w:numPr>
-        <w:spacing w:after="60"/>
-      </w:pPr>
-      <w:r>
-        <w:rPr>
-          <w:rFonts w:ascii="Calibri" w:cs="Calibri" w:eastAsia="Calibri" w:hAnsi="Calibri"/>
-          <w:b/>
-          <w:bCs/>
-          <w:sz w:val="20"/>
-          <w:szCs w:val="20"/>
-        </w:rPr>
-        <w:t xml:space="preserve">Fix definitions before setting targets.</w:t>
-      </w:r>
-      <w:r>
-        <w:rPr>
-          <w:rFonts w:ascii="Calibri" w:cs="Calibri" w:eastAsia="Calibri" w:hAnsi="Calibri"/>
-          <w:sz w:val="20"/>
-          <w:szCs w:val="20"/>
-        </w:rPr>
-        <w:t xml:space="preserve"> A target on an inconsistent measure produces reporting behavior, not operating improvement.</w:t>
-      </w:r>
-    </w:p>
-    <w:p>
-      <w:pPr>
-        <w:pStyle w:val="ListParagraph"/>
-        <w:numPr>
-          <w:ilvl w:val="0"/>
-          <w:numId w:val="2"/>
-        </w:numPr>
-        <w:spacing w:after="60"/>
-      </w:pPr>
-      <w:r>
-        <w:rPr>
-          <w:rFonts w:ascii="Calibri" w:cs="Calibri" w:eastAsia="Calibri" w:hAnsi="Calibri"/>
-          <w:sz w:val="20"/>
-          <w:szCs w:val="20"/>
-        </w:rPr>
-        <w:t xml:space="preserve">Publish the region’s numbers internally so sites can see each other. Visible comparability drives more improvement than any target set from Baltimore.</w:t>
-      </w:r>
-    </w:p>
-    <w:p>
-      <w:pPr>
-        <w:pStyle w:val="ListParagraph"/>
-        <w:numPr>
-          <w:ilvl w:val="0"/>
-          <w:numId w:val="2"/>
-        </w:numPr>
-        <w:spacing w:after="60"/>
-      </w:pPr>
-      <w:r>
-        <w:rPr>
-          <w:rFonts w:ascii="Calibri" w:cs="Calibri" w:eastAsia="Calibri" w:hAnsi="Calibri"/>
-          <w:sz w:val="20"/>
-          <w:szCs w:val="20"/>
-        </w:rPr>
-        <w:t xml:space="preserve">Protect what works. Where a sub-region already performs, the cadence should confirm it and get out of the way. Technical authority stays with the technical leaders who hold the licenses.</w:t>
+        <w:t xml:space="preserve">Phase II · Days 31–60 · Gap Analysis and Harmonization</w:t>
+      </w:r>
+    </w:p>
+    <w:p>
+      <w:pPr>
+        <w:pStyle w:val="ListParagraph"/>
+        <w:numPr>
+          <w:ilvl w:val="0"/>
+          <w:numId w:val="2"/>
+        </w:numPr>
+        <w:spacing w:after="60"/>
+      </w:pPr>
+      <w:r>
+        <w:rPr>
+          <w:rFonts w:ascii="Calibri" w:cs="Calibri" w:eastAsia="Calibri" w:hAnsi="Calibri"/>
+          <w:sz w:val="20"/>
+          <w:szCs w:val="20"/>
+        </w:rPr>
+        <w:t xml:space="preserve">Gap analysis against a single defined standard: what each site does today versus what the region needs to do in common.</w:t>
+      </w:r>
+    </w:p>
+    <w:p>
+      <w:pPr>
+        <w:pStyle w:val="ListParagraph"/>
+        <w:numPr>
+          <w:ilvl w:val="0"/>
+          <w:numId w:val="2"/>
+        </w:numPr>
+        <w:spacing w:after="60"/>
+      </w:pPr>
+      <w:r>
+        <w:rPr>
+          <w:rFonts w:ascii="Calibri" w:cs="Calibri" w:eastAsia="Calibri" w:hAnsi="Calibri"/>
+          <w:sz w:val="20"/>
+          <w:szCs w:val="20"/>
+        </w:rPr>
+        <w:t xml:space="preserve">A harmonized metric set, defined identically everywhere and small enough that site leadership can produce it without a project: backlog and aging, on-time turnaround, open corrective actions, overtime.</w:t>
+      </w:r>
+    </w:p>
+    <w:p>
+      <w:pPr>
+        <w:pStyle w:val="ListParagraph"/>
+        <w:numPr>
+          <w:ilvl w:val="0"/>
+          <w:numId w:val="2"/>
+        </w:numPr>
+        <w:spacing w:after="60"/>
+      </w:pPr>
+      <w:r>
+        <w:rPr>
+          <w:rFonts w:ascii="Calibri" w:cs="Calibri" w:eastAsia="Calibri" w:hAnsi="Calibri"/>
+          <w:sz w:val="20"/>
+          <w:szCs w:val="20"/>
+        </w:rPr>
+        <w:t xml:space="preserve">A monthly management review per site on a common agenda — performance to plan, capacity, quality, people — so the regional roll-up is built from comparable inputs.</w:t>
+      </w:r>
+    </w:p>
+    <w:p>
+      <w:pPr>
+        <w:pStyle w:val="ListParagraph"/>
+        <w:numPr>
+          <w:ilvl w:val="0"/>
+          <w:numId w:val="2"/>
+        </w:numPr>
+        <w:spacing w:after="60"/>
+      </w:pPr>
+      <w:r>
+        <w:rPr>
+          <w:rFonts w:ascii="Calibri" w:cs="Calibri" w:eastAsia="Calibri" w:hAnsi="Calibri"/>
+          <w:b/>
+          <w:bCs/>
+          <w:sz w:val="20"/>
+          <w:szCs w:val="20"/>
+        </w:rPr>
+        <w:t xml:space="preserve">Specification before target.</w:t>
+      </w:r>
+      <w:r>
+        <w:rPr>
+          <w:rFonts w:ascii="Calibri" w:cs="Calibri" w:eastAsia="Calibri" w:hAnsi="Calibri"/>
+          <w:sz w:val="20"/>
+          <w:szCs w:val="20"/>
+        </w:rPr>
+        <w:t xml:space="preserve"> Setting a target on an unharmonized measure produces reporting behavior rather than improvement — the same reason a method is qualified before its results are trended.</w:t>
+      </w:r>
+    </w:p>
+    <w:p>
+      <w:pPr>
+        <w:pStyle w:val="ListParagraph"/>
+        <w:numPr>
+          <w:ilvl w:val="0"/>
+          <w:numId w:val="2"/>
+        </w:numPr>
+        <w:spacing w:after="60"/>
+      </w:pPr>
+      <w:r>
+        <w:rPr>
+          <w:rFonts w:ascii="Calibri" w:cs="Calibri" w:eastAsia="Calibri" w:hAnsi="Calibri"/>
+          <w:sz w:val="20"/>
+          <w:szCs w:val="20"/>
+        </w:rPr>
+        <w:t xml:space="preserve">Trend the region visibly so sites can see one another. Internal comparability drives more improvement than any target set from Baltimore.</w:t>
+      </w:r>
+    </w:p>
+    <w:p>
+      <w:pPr>
+        <w:pStyle w:val="ListParagraph"/>
+        <w:numPr>
+          <w:ilvl w:val="0"/>
+          <w:numId w:val="2"/>
+        </w:numPr>
+        <w:spacing w:after="60"/>
+      </w:pPr>
+      <w:r>
+        <w:rPr>
+          <w:rFonts w:ascii="Calibri" w:cs="Calibri" w:eastAsia="Calibri" w:hAnsi="Calibri"/>
+          <w:b/>
+          <w:bCs/>
+          <w:sz w:val="20"/>
+          <w:szCs w:val="20"/>
+        </w:rPr>
+        <w:t xml:space="preserve">Protect what already conforms.</w:t>
+      </w:r>
+      <w:r>
+        <w:rPr>
+          <w:rFonts w:ascii="Calibri" w:cs="Calibri" w:eastAsia="Calibri" w:hAnsi="Calibri"/>
+          <w:sz w:val="20"/>
+          <w:szCs w:val="20"/>
+        </w:rPr>
+        <w:t xml:space="preserve"> Where a sub-region performs, the cadence confirms it and gets out of the way. Technical authority stays with the technical leadership holding the licenses — this is an operations harmonization, not a scientific one.</w:t>
       </w:r>
     </w:p>
     <w:p>
@@ -405,7 +448,7 @@
           <w:sz w:val="20"/>
           <w:szCs w:val="20"/>
         </w:rPr>
-        <w:t xml:space="preserve">a single regional operating review running on common definitions.</w:t>
+        <w:t xml:space="preserve">a documented gap analysis, and one regional management review running on harmonized definitions.</w:t>
       </w:r>
     </w:p>
     <w:p>
@@ -425,61 +468,61 @@
           <w:sz w:val="21"/>
           <w:szCs w:val="21"/>
         </w:rPr>
-        <w:t xml:space="preserve">Days 61–90 · One visible win, and a plan.</w:t>
-      </w:r>
-    </w:p>
-    <w:p>
-      <w:pPr>
-        <w:pStyle w:val="ListParagraph"/>
-        <w:numPr>
-          <w:ilvl w:val="0"/>
-          <w:numId w:val="2"/>
-        </w:numPr>
-        <w:spacing w:after="60"/>
-      </w:pPr>
-      <w:r>
-        <w:rPr>
-          <w:rFonts w:ascii="Calibri" w:cs="Calibri" w:eastAsia="Calibri" w:hAnsi="Calibri"/>
-          <w:sz w:val="20"/>
-          <w:szCs w:val="20"/>
-        </w:rPr>
-        <w:t xml:space="preserve">Fix the most expensive addressable problem found in the first thirty days, end to end, at one site, with a number attached. Usually a turnaround bottleneck — often data review queued behind one or two approvers — or a reanalysis rate nobody has priced.</w:t>
-      </w:r>
-    </w:p>
-    <w:p>
-      <w:pPr>
-        <w:pStyle w:val="ListParagraph"/>
-        <w:numPr>
-          <w:ilvl w:val="0"/>
-          <w:numId w:val="2"/>
-        </w:numPr>
-        <w:spacing w:after="60"/>
-      </w:pPr>
-      <w:r>
-        <w:rPr>
-          <w:rFonts w:ascii="Calibri" w:cs="Calibri" w:eastAsia="Calibri" w:hAnsi="Calibri"/>
-          <w:sz w:val="20"/>
-          <w:szCs w:val="20"/>
-        </w:rPr>
-        <w:t xml:space="preserve">Bring an answer to the 2027 demand question. Two federal drinking-water deadlines land that year, and compliance samples arrive in the final quarters before a deadline rather than evenly. Capacity, staffing and scheduling should be decided in advance, not absorbed.</w:t>
-      </w:r>
-    </w:p>
-    <w:p>
-      <w:pPr>
-        <w:pStyle w:val="ListParagraph"/>
-        <w:numPr>
-          <w:ilvl w:val="0"/>
-          <w:numId w:val="2"/>
-        </w:numPr>
-        <w:spacing w:after="60"/>
-      </w:pPr>
-      <w:r>
-        <w:rPr>
-          <w:rFonts w:ascii="Calibri" w:cs="Calibri" w:eastAsia="Calibri" w:hAnsi="Calibri"/>
-          <w:sz w:val="20"/>
-          <w:szCs w:val="20"/>
-        </w:rPr>
-        <w:t xml:space="preserve">Deliver a written twelve-month regional plan: capacity and capital, accredited scope, staffing and development, and where growth comes from.</w:t>
+        <w:t xml:space="preserve">Phase III · Days 61–90 · Corrective Action and Remediation Plan</w:t>
+      </w:r>
+    </w:p>
+    <w:p>
+      <w:pPr>
+        <w:pStyle w:val="ListParagraph"/>
+        <w:numPr>
+          <w:ilvl w:val="0"/>
+          <w:numId w:val="2"/>
+        </w:numPr>
+        <w:spacing w:after="60"/>
+      </w:pPr>
+      <w:r>
+        <w:rPr>
+          <w:rFonts w:ascii="Calibri" w:cs="Calibri" w:eastAsia="Calibri" w:hAnsi="Calibri"/>
+          <w:sz w:val="20"/>
+          <w:szCs w:val="20"/>
+        </w:rPr>
+        <w:t xml:space="preserve">Take the highest-cost finding from Phase I, establish root cause rather than treating the symptom, implement the correction at one site, and define the effectiveness check. In most laboratories this is a turnaround bottleneck — often data review queued behind one or two approvers — or a reanalysis rate nobody has priced.</w:t>
+      </w:r>
+    </w:p>
+    <w:p>
+      <w:pPr>
+        <w:pStyle w:val="ListParagraph"/>
+        <w:numPr>
+          <w:ilvl w:val="0"/>
+          <w:numId w:val="2"/>
+        </w:numPr>
+        <w:spacing w:after="60"/>
+      </w:pPr>
+      <w:r>
+        <w:rPr>
+          <w:rFonts w:ascii="Calibri" w:cs="Calibri" w:eastAsia="Calibri" w:hAnsi="Calibri"/>
+          <w:sz w:val="20"/>
+          <w:szCs w:val="20"/>
+        </w:rPr>
+        <w:t xml:space="preserve">Capacity planning for 2027: two federal drinking-water deadlines land that year, and compliance samples arrive in the final quarters before a deadline rather than evenly. Staffing, scheduling and scope decided in advance rather than absorbed.</w:t>
+      </w:r>
+    </w:p>
+    <w:p>
+      <w:pPr>
+        <w:pStyle w:val="ListParagraph"/>
+        <w:numPr>
+          <w:ilvl w:val="0"/>
+          <w:numId w:val="2"/>
+        </w:numPr>
+        <w:spacing w:after="60"/>
+      </w:pPr>
+      <w:r>
+        <w:rPr>
+          <w:rFonts w:ascii="Calibri" w:cs="Calibri" w:eastAsia="Calibri" w:hAnsi="Calibri"/>
+          <w:sz w:val="20"/>
+          <w:szCs w:val="20"/>
+        </w:rPr>
+        <w:t xml:space="preserve">A written twelve-month regional plan: capacity and capital, accredited scope, staffing and development, and where growth comes from.</w:t>
       </w:r>
     </w:p>
     <w:p>
@@ -502,7 +545,7 @@
           <w:sz w:val="20"/>
           <w:szCs w:val="20"/>
         </w:rPr>
-        <w:t xml:space="preserve">one proven improvement, and a plan the region has agreed to.</w:t>
+        <w:t xml:space="preserve">one corrective action implemented with its effectiveness check defined, and a twelve-month plan the region has agreed to.</w:t>
       </w:r>
     </w:p>
     <w:p>
@@ -522,79 +565,79 @@
           <w:sz w:val="21"/>
           <w:szCs w:val="21"/>
         </w:rPr>
-        <w:t xml:space="preserve">What I Would Want From You</w:t>
-      </w:r>
-    </w:p>
-    <w:p>
-      <w:pPr>
-        <w:pStyle w:val="ListParagraph"/>
-        <w:numPr>
-          <w:ilvl w:val="0"/>
-          <w:numId w:val="2"/>
-        </w:numPr>
-        <w:spacing w:after="60"/>
-      </w:pPr>
-      <w:r>
-        <w:rPr>
-          <w:rFonts w:ascii="Calibri" w:cs="Calibri" w:eastAsia="Calibri" w:hAnsi="Calibri"/>
-          <w:sz w:val="20"/>
-          <w:szCs w:val="20"/>
-        </w:rPr>
-        <w:t xml:space="preserve">Clarity on which sites are mine, and whether the P&amp;L is cut by site, by division, or by region.</w:t>
-      </w:r>
-    </w:p>
-    <w:p>
-      <w:pPr>
-        <w:pStyle w:val="ListParagraph"/>
-        <w:numPr>
-          <w:ilvl w:val="0"/>
-          <w:numId w:val="2"/>
-        </w:numPr>
-        <w:spacing w:after="60"/>
-      </w:pPr>
-      <w:r>
-        <w:rPr>
-          <w:rFonts w:ascii="Calibri" w:cs="Calibri" w:eastAsia="Calibri" w:hAnsi="Calibri"/>
-          <w:sz w:val="20"/>
-          <w:szCs w:val="20"/>
-        </w:rPr>
-        <w:t xml:space="preserve">Clarity on what I can decide and what comes to you first.</w:t>
-      </w:r>
-    </w:p>
-    <w:p>
-      <w:pPr>
-        <w:pStyle w:val="ListParagraph"/>
-        <w:numPr>
-          <w:ilvl w:val="0"/>
-          <w:numId w:val="2"/>
-        </w:numPr>
-        <w:spacing w:after="60"/>
-      </w:pPr>
-      <w:r>
-        <w:rPr>
-          <w:rFonts w:ascii="Calibri" w:cs="Calibri" w:eastAsia="Calibri" w:hAnsi="Calibri"/>
-          <w:sz w:val="20"/>
-          <w:szCs w:val="20"/>
-        </w:rPr>
-        <w:t xml:space="preserve">An introduction to my finance counterpart, and access to whatever facility-level tracking already exists.</w:t>
-      </w:r>
-    </w:p>
-    <w:p>
-      <w:pPr>
-        <w:pStyle w:val="ListParagraph"/>
-        <w:numPr>
-          <w:ilvl w:val="0"/>
-          <w:numId w:val="2"/>
-        </w:numPr>
-        <w:spacing w:after="60"/>
-      </w:pPr>
-      <w:r>
-        <w:rPr>
-          <w:rFonts w:ascii="Calibri" w:cs="Calibri" w:eastAsia="Calibri" w:hAnsi="Calibri"/>
-          <w:sz w:val="20"/>
-          <w:szCs w:val="20"/>
-        </w:rPr>
-        <w:t xml:space="preserve">Patience for thirty days of questions before I propose changes.</w:t>
+        <w:t xml:space="preserve">Inputs I Would Need</w:t>
+      </w:r>
+    </w:p>
+    <w:p>
+      <w:pPr>
+        <w:pStyle w:val="ListParagraph"/>
+        <w:numPr>
+          <w:ilvl w:val="0"/>
+          <w:numId w:val="2"/>
+        </w:numPr>
+        <w:spacing w:after="60"/>
+      </w:pPr>
+      <w:r>
+        <w:rPr>
+          <w:rFonts w:ascii="Calibri" w:cs="Calibri" w:eastAsia="Calibri" w:hAnsi="Calibri"/>
+          <w:sz w:val="20"/>
+          <w:szCs w:val="20"/>
+        </w:rPr>
+        <w:t xml:space="preserve">Which sites are in scope, and whether the P&amp;L is cut by site, by division, or by region.</w:t>
+      </w:r>
+    </w:p>
+    <w:p>
+      <w:pPr>
+        <w:pStyle w:val="ListParagraph"/>
+        <w:numPr>
+          <w:ilvl w:val="0"/>
+          <w:numId w:val="2"/>
+        </w:numPr>
+        <w:spacing w:after="60"/>
+      </w:pPr>
+      <w:r>
+        <w:rPr>
+          <w:rFonts w:ascii="Calibri" w:cs="Calibri" w:eastAsia="Calibri" w:hAnsi="Calibri"/>
+          <w:sz w:val="20"/>
+          <w:szCs w:val="20"/>
+        </w:rPr>
+        <w:t xml:space="preserve">Defined decision rights — what I can approve, and what comes to you first.</w:t>
+      </w:r>
+    </w:p>
+    <w:p>
+      <w:pPr>
+        <w:pStyle w:val="ListParagraph"/>
+        <w:numPr>
+          <w:ilvl w:val="0"/>
+          <w:numId w:val="2"/>
+        </w:numPr>
+        <w:spacing w:after="60"/>
+      </w:pPr>
+      <w:r>
+        <w:rPr>
+          <w:rFonts w:ascii="Calibri" w:cs="Calibri" w:eastAsia="Calibri" w:hAnsi="Calibri"/>
+          <w:sz w:val="20"/>
+          <w:szCs w:val="20"/>
+        </w:rPr>
+        <w:t xml:space="preserve">An introduction to my finance counterpart, and access to whatever facility-level reporting already exists.</w:t>
+      </w:r>
+    </w:p>
+    <w:p>
+      <w:pPr>
+        <w:pStyle w:val="ListParagraph"/>
+        <w:numPr>
+          <w:ilvl w:val="0"/>
+          <w:numId w:val="2"/>
+        </w:numPr>
+        <w:spacing w:after="60"/>
+      </w:pPr>
+      <w:r>
+        <w:rPr>
+          <w:rFonts w:ascii="Calibri" w:cs="Calibri" w:eastAsia="Calibri" w:hAnsi="Calibri"/>
+          <w:sz w:val="20"/>
+          <w:szCs w:val="20"/>
+        </w:rPr>
+        <w:t xml:space="preserve">Thirty days of questions before I propose changes.</w:t>
       </w:r>
     </w:p>
     <w:p>
@@ -614,7 +657,7 @@
           <w:sz w:val="21"/>
           <w:szCs w:val="21"/>
         </w:rPr>
-        <w:t xml:space="preserve">What I Will Not Do</w:t>
+        <w:t xml:space="preserve">Controls I Would Hold Myself To</w:t>
       </w:r>
     </w:p>
     <w:p>
@@ -627,7 +670,7 @@
           <w:sz w:val="20"/>
           <w:szCs w:val="20"/>
         </w:rPr>
-        <w:t xml:space="preserve">Reorganize a functioning team before I understand why it works. Set targets on measures that are not yet consistent. Trade defensible data for a faster month — a late result is recoverable, a result that does not hold up is not.</w:t>
+        <w:t xml:space="preserve">No reorganization of a functioning team before the root cause is understood. No targets on measures that are not yet harmonized. And no trading defensible data for a faster month — a late result is recoverable, a result that does not hold up is not.</w:t>
       </w:r>
     </w:p>
     <w:sectPr>

</xml_diff>

<commit_message>
90-day plan: sequenced around Baltimore first, then Richmond
Rebuilt to match what Chris Long described and what Evan intends: Baltimore
two to three days a week as the anchor, Richmond second, the rest of the
territory on a defined schedule across year one. Adds exit criteria for
when Baltimore stops being the priority - on-time turnaround holding two
months on the harmonized definition, backlog stable rather than rescued,
corrective actions closing faster than they open, site leadership
producing the weekly metrics without him, and one improvement past its
effectiveness check - plus a year-one section and a control against
adding a site while Baltimore is unstable.
</commit_message>
<xml_diff>
--- a/Applications/2026-09-30 Microbac - Regional Lab Ops Director (Mid-Atlantic)/Evan Parnell - First 90 Days - Mid-Atlantic Region.docx
+++ b/Applications/2026-09-30 Microbac - Regional Lab Ops Director (Mid-Atlantic)/Evan Parnell - First 90 Days - Mid-Atlantic Region.docx
@@ -50,7 +50,7 @@
           <w:sz w:val="18"/>
           <w:szCs w:val="18"/>
         </w:rPr>
-        <w:t xml:space="preserve">A working outline offered for discussion, not a finished plan — it should change once I can see the region’s actual data.</w:t>
+        <w:t xml:space="preserve">A working outline offered for discussion — it should change once I can see the region’s actual data.</w:t>
       </w:r>
     </w:p>
     <w:p>
@@ -95,13 +95,46 @@
         </w:rPr>
         <w:t xml:space="preserve">Characterize first, harmonize second, restructure last.</w:t>
       </w:r>
-      <w:r>
-        <w:rPr>
-          <w:rFonts w:ascii="Calibri" w:cs="Calibri" w:eastAsia="Calibri" w:hAnsi="Calibri"/>
-          <w:sz w:val="20"/>
-          <w:szCs w:val="20"/>
-        </w:rPr>
-        <w:t xml:space="preserve"> I would rather spend thirty days establishing a defensible baseline than take corrective action against a problem I have not yet confirmed.</w:t>
+    </w:p>
+    <w:p>
+      <w:pPr>
+        <w:spacing w:after="90" w:before="0"/>
+      </w:pPr>
+      <w:r>
+        <w:rPr>
+          <w:rFonts w:ascii="Calibri" w:cs="Calibri" w:eastAsia="Calibri" w:hAnsi="Calibri"/>
+          <w:b/>
+          <w:bCs/>
+          <w:sz w:val="20"/>
+          <w:szCs w:val="20"/>
+        </w:rPr>
+        <w:t xml:space="preserve">And sequence it. </w:t>
+      </w:r>
+      <w:r>
+        <w:rPr>
+          <w:rFonts w:ascii="Calibri" w:cs="Calibri" w:eastAsia="Calibri" w:hAnsi="Calibri"/>
+          <w:sz w:val="20"/>
+          <w:szCs w:val="20"/>
+        </w:rPr>
+        <w:t xml:space="preserve">Baltimore is the anchor and my base, so it comes first — several days a week on site, not a visit. Richmond follows. The remaining sites get a defined schedule across the first year. </w:t>
+      </w:r>
+      <w:r>
+        <w:rPr>
+          <w:rFonts w:ascii="Calibri" w:cs="Calibri" w:eastAsia="Calibri" w:hAnsi="Calibri"/>
+          <w:b/>
+          <w:bCs/>
+          <w:sz w:val="20"/>
+          <w:szCs w:val="20"/>
+        </w:rPr>
+        <w:t xml:space="preserve">I would not widen the scope until Baltimore meets stated exit criteria</w:t>
+      </w:r>
+      <w:r>
+        <w:rPr>
+          <w:rFonts w:ascii="Calibri" w:cs="Calibri" w:eastAsia="Calibri" w:hAnsi="Calibri"/>
+          <w:sz w:val="20"/>
+          <w:szCs w:val="20"/>
+        </w:rPr>
+        <w:t xml:space="preserve"> — taking on five sites at once is how a regional role becomes a reporting function instead of an operating one.</w:t>
       </w:r>
     </w:p>
     <w:p>
@@ -121,7 +154,7 @@
           <w:sz w:val="21"/>
           <w:szCs w:val="21"/>
         </w:rPr>
-        <w:t xml:space="preserve">Phase I · Days 1–30 · Current-State Assessment</w:t>
+        <w:t xml:space="preserve">Phase I · Days 1–30 · Current-State Assessment, Baltimore</w:t>
       </w:r>
     </w:p>
     <w:p>
@@ -151,46 +184,56 @@
       <w:r>
         <w:rPr>
           <w:rFonts w:ascii="Calibri" w:cs="Calibri" w:eastAsia="Calibri" w:hAnsi="Calibri"/>
-          <w:sz w:val="20"/>
-          <w:szCs w:val="20"/>
-        </w:rPr>
-        <w:t xml:space="preserve">On-site assessment at every laboratory and service center in the region — time at the bench, not only in the office.</w:t>
-      </w:r>
-    </w:p>
-    <w:p>
-      <w:pPr>
-        <w:pStyle w:val="ListParagraph"/>
-        <w:numPr>
-          <w:ilvl w:val="0"/>
-          <w:numId w:val="2"/>
-        </w:numPr>
-        <w:spacing w:after="60"/>
-      </w:pPr>
-      <w:r>
-        <w:rPr>
-          <w:rFonts w:ascii="Calibri" w:cs="Calibri" w:eastAsia="Calibri" w:hAnsi="Calibri"/>
-          <w:sz w:val="20"/>
-          <w:szCs w:val="20"/>
-        </w:rPr>
-        <w:t xml:space="preserve">Interviews at three levels: laboratory and division management, technical and quality leadership, and the analysts and sample-receiving staff who see the failures first.</w:t>
-      </w:r>
-    </w:p>
-    <w:p>
-      <w:pPr>
-        <w:pStyle w:val="ListParagraph"/>
-        <w:numPr>
-          <w:ilvl w:val="0"/>
-          <w:numId w:val="2"/>
-        </w:numPr>
-        <w:spacing w:after="60"/>
-      </w:pPr>
-      <w:r>
-        <w:rPr>
-          <w:rFonts w:ascii="Calibri" w:cs="Calibri" w:eastAsia="Calibri" w:hAnsi="Calibri"/>
-          <w:sz w:val="20"/>
-          <w:szCs w:val="20"/>
-        </w:rPr>
-        <w:t xml:space="preserve">Retrospective review of twelve months by site: revenue and margin to plan, cost per sample, on-time turnaround, reanalysis and rework rate, overtime, instrument uptime, open corrective actions, accredited scope.</w:t>
+          <w:b/>
+          <w:bCs/>
+          <w:sz w:val="20"/>
+          <w:szCs w:val="20"/>
+        </w:rPr>
+        <w:t xml:space="preserve">Baltimore, two to three days a week</w:t>
+      </w:r>
+      <w:r>
+        <w:rPr>
+          <w:rFonts w:ascii="Calibri" w:cs="Calibri" w:eastAsia="Calibri" w:hAnsi="Calibri"/>
+          <w:sz w:val="20"/>
+          <w:szCs w:val="20"/>
+        </w:rPr>
+        <w:t xml:space="preserve"> — time at the bench and in sample receiving, not only in the office.</w:t>
+      </w:r>
+    </w:p>
+    <w:p>
+      <w:pPr>
+        <w:pStyle w:val="ListParagraph"/>
+        <w:numPr>
+          <w:ilvl w:val="0"/>
+          <w:numId w:val="2"/>
+        </w:numPr>
+        <w:spacing w:after="60"/>
+      </w:pPr>
+      <w:r>
+        <w:rPr>
+          <w:rFonts w:ascii="Calibri" w:cs="Calibri" w:eastAsia="Calibri" w:hAnsi="Calibri"/>
+          <w:sz w:val="20"/>
+          <w:szCs w:val="20"/>
+        </w:rPr>
+        <w:t xml:space="preserve">Interviews at three levels: site and division management, technical and quality leadership, and the analysts and receiving staff who see the failures first.</w:t>
+      </w:r>
+    </w:p>
+    <w:p>
+      <w:pPr>
+        <w:pStyle w:val="ListParagraph"/>
+        <w:numPr>
+          <w:ilvl w:val="0"/>
+          <w:numId w:val="2"/>
+        </w:numPr>
+        <w:spacing w:after="60"/>
+      </w:pPr>
+      <w:r>
+        <w:rPr>
+          <w:rFonts w:ascii="Calibri" w:cs="Calibri" w:eastAsia="Calibri" w:hAnsi="Calibri"/>
+          <w:sz w:val="20"/>
+          <w:szCs w:val="20"/>
+        </w:rPr>
+        <w:t xml:space="preserve">Retrospective review of twelve months at Baltimore: revenue and margin to plan, cost per sample, on-time turnaround, reanalysis and rework rate, overtime, instrument uptime, open corrective actions, accredited scope, and certified method coverage by analyst.</w:t>
       </w:r>
     </w:p>
     <w:p>
@@ -218,43 +261,53 @@
           <w:sz w:val="20"/>
           <w:szCs w:val="20"/>
         </w:rPr>
-        <w:t xml:space="preserve"> Confirm every site calculates those the same way. Turnaround especially — received-to-reported versus scheduled-to-reported is where the variance hides.</w:t>
-      </w:r>
-    </w:p>
-    <w:p>
-      <w:pPr>
-        <w:pStyle w:val="ListParagraph"/>
-        <w:numPr>
-          <w:ilvl w:val="0"/>
-          <w:numId w:val="2"/>
-        </w:numPr>
-        <w:spacing w:after="60"/>
-      </w:pPr>
-      <w:r>
-        <w:rPr>
-          <w:rFonts w:ascii="Calibri" w:cs="Calibri" w:eastAsia="Calibri" w:hAnsi="Calibri"/>
-          <w:sz w:val="20"/>
-          <w:szCs w:val="20"/>
-        </w:rPr>
-        <w:t xml:space="preserve">Map the network as it actually is: which sites are full-service laboratories, which are focused benches, which are service centers, and where each site’s accredited scope begins and ends.</w:t>
-      </w:r>
-    </w:p>
-    <w:p>
-      <w:pPr>
-        <w:pStyle w:val="ListParagraph"/>
-        <w:numPr>
-          <w:ilvl w:val="0"/>
-          <w:numId w:val="2"/>
-        </w:numPr>
-        <w:spacing w:after="60"/>
-      </w:pPr>
-      <w:r>
-        <w:rPr>
-          <w:rFonts w:ascii="Calibri" w:cs="Calibri" w:eastAsia="Calibri" w:hAnsi="Calibri"/>
-          <w:sz w:val="20"/>
-          <w:szCs w:val="20"/>
-        </w:rPr>
-        <w:t xml:space="preserve">Client view: the top accounts at each site, and what each would say about us if I called them.</w:t>
+        <w:t xml:space="preserve"> Turnaround especially — received-to-reported versus scheduled-to-reported is where the variance hides.</w:t>
+      </w:r>
+    </w:p>
+    <w:p>
+      <w:pPr>
+        <w:pStyle w:val="ListParagraph"/>
+        <w:numPr>
+          <w:ilvl w:val="0"/>
+          <w:numId w:val="2"/>
+        </w:numPr>
+        <w:spacing w:after="60"/>
+      </w:pPr>
+      <w:r>
+        <w:rPr>
+          <w:rFonts w:ascii="Calibri" w:cs="Calibri" w:eastAsia="Calibri" w:hAnsi="Calibri"/>
+          <w:b/>
+          <w:bCs/>
+          <w:sz w:val="20"/>
+          <w:szCs w:val="20"/>
+        </w:rPr>
+        <w:t xml:space="preserve">One familiarization visit to Richmond</w:t>
+      </w:r>
+      <w:r>
+        <w:rPr>
+          <w:rFonts w:ascii="Calibri" w:cs="Calibri" w:eastAsia="Calibri" w:hAnsi="Calibri"/>
+          <w:sz w:val="20"/>
+          <w:szCs w:val="20"/>
+        </w:rPr>
+        <w:t xml:space="preserve">, and a data-level review of the rest of the territory so the region is mapped even where I am not yet working: which sites are full-service laboratories, which are focused benches, which are service centers, and where each accredited scope begins and ends.</w:t>
+      </w:r>
+    </w:p>
+    <w:p>
+      <w:pPr>
+        <w:pStyle w:val="ListParagraph"/>
+        <w:numPr>
+          <w:ilvl w:val="0"/>
+          <w:numId w:val="2"/>
+        </w:numPr>
+        <w:spacing w:after="60"/>
+      </w:pPr>
+      <w:r>
+        <w:rPr>
+          <w:rFonts w:ascii="Calibri" w:cs="Calibri" w:eastAsia="Calibri" w:hAnsi="Calibri"/>
+          <w:sz w:val="20"/>
+          <w:szCs w:val="20"/>
+        </w:rPr>
+        <w:t xml:space="preserve">Client view: the top accounts at Baltimore, and what each would say about us if I called them.</w:t>
       </w:r>
     </w:p>
     <w:p>
@@ -277,7 +330,7 @@
           <w:sz w:val="20"/>
           <w:szCs w:val="20"/>
         </w:rPr>
-        <w:t xml:space="preserve">a written baseline of the region as it is — with anything not yet verifiable identified as such rather than assumed.</w:t>
+        <w:t xml:space="preserve">a written baseline for Baltimore, a map of the territory, and anything not yet verifiable identified as such rather than assumed.</w:t>
       </w:r>
     </w:p>
     <w:p>
@@ -315,43 +368,81 @@
           <w:sz w:val="20"/>
           <w:szCs w:val="20"/>
         </w:rPr>
-        <w:t xml:space="preserve">Gap analysis against a single defined standard: what each site does today versus what the region needs to do in common.</w:t>
-      </w:r>
-    </w:p>
-    <w:p>
-      <w:pPr>
-        <w:pStyle w:val="ListParagraph"/>
-        <w:numPr>
-          <w:ilvl w:val="0"/>
-          <w:numId w:val="2"/>
-        </w:numPr>
-        <w:spacing w:after="60"/>
-      </w:pPr>
-      <w:r>
-        <w:rPr>
-          <w:rFonts w:ascii="Calibri" w:cs="Calibri" w:eastAsia="Calibri" w:hAnsi="Calibri"/>
-          <w:sz w:val="20"/>
-          <w:szCs w:val="20"/>
-        </w:rPr>
-        <w:t xml:space="preserve">A harmonized metric set, defined identically everywhere and small enough that site leadership can produce it without a project: backlog and aging, on-time turnaround, open corrective actions, overtime.</w:t>
-      </w:r>
-    </w:p>
-    <w:p>
-      <w:pPr>
-        <w:pStyle w:val="ListParagraph"/>
-        <w:numPr>
-          <w:ilvl w:val="0"/>
-          <w:numId w:val="2"/>
-        </w:numPr>
-        <w:spacing w:after="60"/>
-      </w:pPr>
-      <w:r>
-        <w:rPr>
-          <w:rFonts w:ascii="Calibri" w:cs="Calibri" w:eastAsia="Calibri" w:hAnsi="Calibri"/>
-          <w:sz w:val="20"/>
-          <w:szCs w:val="20"/>
-        </w:rPr>
-        <w:t xml:space="preserve">A monthly management review per site on a common agenda — performance to plan, capacity, quality, people — so the regional roll-up is built from comparable inputs.</w:t>
+        <w:t xml:space="preserve">Gap analysis at Baltimore against a single defined standard: what the site does today versus what the region needs to do in common.</w:t>
+      </w:r>
+    </w:p>
+    <w:p>
+      <w:pPr>
+        <w:pStyle w:val="ListParagraph"/>
+        <w:numPr>
+          <w:ilvl w:val="0"/>
+          <w:numId w:val="2"/>
+        </w:numPr>
+        <w:spacing w:after="60"/>
+      </w:pPr>
+      <w:r>
+        <w:rPr>
+          <w:rFonts w:ascii="Calibri" w:cs="Calibri" w:eastAsia="Calibri" w:hAnsi="Calibri"/>
+          <w:b/>
+          <w:bCs/>
+          <w:sz w:val="20"/>
+          <w:szCs w:val="20"/>
+        </w:rPr>
+        <w:t xml:space="preserve">Build the regional metric set at Baltimore first</w:t>
+      </w:r>
+      <w:r>
+        <w:rPr>
+          <w:rFonts w:ascii="Calibri" w:cs="Calibri" w:eastAsia="Calibri" w:hAnsi="Calibri"/>
+          <w:sz w:val="20"/>
+          <w:szCs w:val="20"/>
+        </w:rPr>
+        <w:t xml:space="preserve"> — defined identically, and small enough that site leadership can produce it without a project: backlog and aging, on-time turnaround, open corrective actions, overtime. Proving it at one site before imposing it on five is the difference between a standard and a memo.</w:t>
+      </w:r>
+    </w:p>
+    <w:p>
+      <w:pPr>
+        <w:pStyle w:val="ListParagraph"/>
+        <w:numPr>
+          <w:ilvl w:val="0"/>
+          <w:numId w:val="2"/>
+        </w:numPr>
+        <w:spacing w:after="60"/>
+      </w:pPr>
+      <w:r>
+        <w:rPr>
+          <w:rFonts w:ascii="Calibri" w:cs="Calibri" w:eastAsia="Calibri" w:hAnsi="Calibri"/>
+          <w:sz w:val="20"/>
+          <w:szCs w:val="20"/>
+        </w:rPr>
+        <w:t xml:space="preserve">A monthly management review on a common agenda — performance to plan, capacity, quality, people — so the regional roll-up is built from comparable inputs.</w:t>
+      </w:r>
+    </w:p>
+    <w:p>
+      <w:pPr>
+        <w:pStyle w:val="ListParagraph"/>
+        <w:numPr>
+          <w:ilvl w:val="0"/>
+          <w:numId w:val="2"/>
+        </w:numPr>
+        <w:spacing w:after="60"/>
+      </w:pPr>
+      <w:r>
+        <w:rPr>
+          <w:rFonts w:ascii="Calibri" w:cs="Calibri" w:eastAsia="Calibri" w:hAnsi="Calibri"/>
+          <w:b/>
+          <w:bCs/>
+          <w:sz w:val="20"/>
+          <w:szCs w:val="20"/>
+        </w:rPr>
+        <w:t xml:space="preserve">Richmond current-state assessment</w:t>
+      </w:r>
+      <w:r>
+        <w:rPr>
+          <w:rFonts w:ascii="Calibri" w:cs="Calibri" w:eastAsia="Calibri" w:hAnsi="Calibri"/>
+          <w:sz w:val="20"/>
+          <w:szCs w:val="20"/>
+        </w:rPr>
+        <w:t xml:space="preserve"> in the same format, now that the format has been tested.</w:t>
       </w:r>
     </w:p>
     <w:p>
@@ -394,24 +485,6 @@
       <w:r>
         <w:rPr>
           <w:rFonts w:ascii="Calibri" w:cs="Calibri" w:eastAsia="Calibri" w:hAnsi="Calibri"/>
-          <w:sz w:val="20"/>
-          <w:szCs w:val="20"/>
-        </w:rPr>
-        <w:t xml:space="preserve">Trend the region visibly so sites can see one another. Internal comparability drives more improvement than any target set from Baltimore.</w:t>
-      </w:r>
-    </w:p>
-    <w:p>
-      <w:pPr>
-        <w:pStyle w:val="ListParagraph"/>
-        <w:numPr>
-          <w:ilvl w:val="0"/>
-          <w:numId w:val="2"/>
-        </w:numPr>
-        <w:spacing w:after="60"/>
-      </w:pPr>
-      <w:r>
-        <w:rPr>
-          <w:rFonts w:ascii="Calibri" w:cs="Calibri" w:eastAsia="Calibri" w:hAnsi="Calibri"/>
           <w:b/>
           <w:bCs/>
           <w:sz w:val="20"/>
@@ -425,7 +498,7 @@
           <w:sz w:val="20"/>
           <w:szCs w:val="20"/>
         </w:rPr>
-        <w:t xml:space="preserve"> Where a sub-region performs, the cadence confirms it and gets out of the way. Technical authority stays with the technical leadership holding the licenses — this is an operations harmonization, not a scientific one.</w:t>
+        <w:t xml:space="preserve"> Where a site performs, the cadence confirms it and gets out of the way. Technical authority stays with the technical leadership holding the licenses — this is an operations harmonization, not a scientific one.</w:t>
       </w:r>
     </w:p>
     <w:p>
@@ -448,7 +521,7 @@
           <w:sz w:val="20"/>
           <w:szCs w:val="20"/>
         </w:rPr>
-        <w:t xml:space="preserve">a documented gap analysis, and one regional management review running on harmonized definitions.</w:t>
+        <w:t xml:space="preserve">a documented gap analysis for Baltimore, a current-state assessment for Richmond, and a management review running on harmonized definitions.</w:t>
       </w:r>
     </w:p>
     <w:p>
@@ -468,25 +541,43 @@
           <w:sz w:val="21"/>
           <w:szCs w:val="21"/>
         </w:rPr>
-        <w:t xml:space="preserve">Phase III · Days 61–90 · Corrective Action and Remediation Plan</w:t>
-      </w:r>
-    </w:p>
-    <w:p>
-      <w:pPr>
-        <w:pStyle w:val="ListParagraph"/>
-        <w:numPr>
-          <w:ilvl w:val="0"/>
-          <w:numId w:val="2"/>
-        </w:numPr>
-        <w:spacing w:after="60"/>
-      </w:pPr>
-      <w:r>
-        <w:rPr>
-          <w:rFonts w:ascii="Calibri" w:cs="Calibri" w:eastAsia="Calibri" w:hAnsi="Calibri"/>
-          <w:sz w:val="20"/>
-          <w:szCs w:val="20"/>
-        </w:rPr>
-        <w:t xml:space="preserve">Take the highest-cost finding from Phase I, establish root cause rather than treating the symptom, implement the correction at one site, and define the effectiveness check. In most laboratories this is a turnaround bottleneck — often data review queued behind one or two approvers — or a reanalysis rate nobody has priced.</w:t>
+        <w:t xml:space="preserve">Phase III · Days 61–90 · Corrective Action and the Year-One Plan</w:t>
+      </w:r>
+    </w:p>
+    <w:p>
+      <w:pPr>
+        <w:pStyle w:val="ListParagraph"/>
+        <w:numPr>
+          <w:ilvl w:val="0"/>
+          <w:numId w:val="2"/>
+        </w:numPr>
+        <w:spacing w:after="60"/>
+      </w:pPr>
+      <w:r>
+        <w:rPr>
+          <w:rFonts w:ascii="Calibri" w:cs="Calibri" w:eastAsia="Calibri" w:hAnsi="Calibri"/>
+          <w:sz w:val="20"/>
+          <w:szCs w:val="20"/>
+        </w:rPr>
+        <w:t xml:space="preserve">Take the highest-cost finding at Baltimore, establish root cause rather than treating the symptom, implement the correction, and define the effectiveness check. In most laboratories this is a turnaround bottleneck — often data review queued behind one or two approvers — or a reanalysis rate nobody has priced.</w:t>
+      </w:r>
+    </w:p>
+    <w:p>
+      <w:pPr>
+        <w:pStyle w:val="ListParagraph"/>
+        <w:numPr>
+          <w:ilvl w:val="0"/>
+          <w:numId w:val="2"/>
+        </w:numPr>
+        <w:spacing w:after="60"/>
+      </w:pPr>
+      <w:r>
+        <w:rPr>
+          <w:rFonts w:ascii="Calibri" w:cs="Calibri" w:eastAsia="Calibri" w:hAnsi="Calibri"/>
+          <w:sz w:val="20"/>
+          <w:szCs w:val="20"/>
+        </w:rPr>
+        <w:t xml:space="preserve">Richmond gap analysis and a corrective plan, sequenced behind Baltimore rather than alongside it.</w:t>
       </w:r>
     </w:p>
     <w:p>
@@ -519,10 +610,20 @@
       <w:r>
         <w:rPr>
           <w:rFonts w:ascii="Calibri" w:cs="Calibri" w:eastAsia="Calibri" w:hAnsi="Calibri"/>
-          <w:sz w:val="20"/>
-          <w:szCs w:val="20"/>
-        </w:rPr>
-        <w:t xml:space="preserve">A written twelve-month regional plan: capacity and capital, accredited scope, staffing and development, and where growth comes from.</w:t>
+          <w:b/>
+          <w:bCs/>
+          <w:sz w:val="20"/>
+          <w:szCs w:val="20"/>
+        </w:rPr>
+        <w:t xml:space="preserve">A written twelve-month plan</w:t>
+      </w:r>
+      <w:r>
+        <w:rPr>
+          <w:rFonts w:ascii="Calibri" w:cs="Calibri" w:eastAsia="Calibri" w:hAnsi="Calibri"/>
+          <w:sz w:val="20"/>
+          <w:szCs w:val="20"/>
+        </w:rPr>
+        <w:t xml:space="preserve"> covering the rest of the territory: the visit schedule, capacity and capital, accredited scope, staffing and development, and where growth comes from.</w:t>
       </w:r>
     </w:p>
     <w:p>
@@ -545,7 +646,7 @@
           <w:sz w:val="20"/>
           <w:szCs w:val="20"/>
         </w:rPr>
-        <w:t xml:space="preserve">one corrective action implemented with its effectiveness check defined, and a twelve-month plan the region has agreed to.</w:t>
+        <w:t xml:space="preserve">one corrective action implemented with its effectiveness check defined, Richmond characterized, and a twelve-month plan the region has agreed to.</w:t>
       </w:r>
     </w:p>
     <w:p>
@@ -565,79 +666,120 @@
           <w:sz w:val="21"/>
           <w:szCs w:val="21"/>
         </w:rPr>
-        <w:t xml:space="preserve">Inputs I Would Need</w:t>
-      </w:r>
-    </w:p>
-    <w:p>
-      <w:pPr>
-        <w:pStyle w:val="ListParagraph"/>
-        <w:numPr>
-          <w:ilvl w:val="0"/>
-          <w:numId w:val="2"/>
-        </w:numPr>
-        <w:spacing w:after="60"/>
-      </w:pPr>
-      <w:r>
-        <w:rPr>
-          <w:rFonts w:ascii="Calibri" w:cs="Calibri" w:eastAsia="Calibri" w:hAnsi="Calibri"/>
-          <w:sz w:val="20"/>
-          <w:szCs w:val="20"/>
-        </w:rPr>
-        <w:t xml:space="preserve">Which sites are in scope, and whether the P&amp;L is cut by site, by division, or by region.</w:t>
-      </w:r>
-    </w:p>
-    <w:p>
-      <w:pPr>
-        <w:pStyle w:val="ListParagraph"/>
-        <w:numPr>
-          <w:ilvl w:val="0"/>
-          <w:numId w:val="2"/>
-        </w:numPr>
-        <w:spacing w:after="60"/>
-      </w:pPr>
-      <w:r>
-        <w:rPr>
-          <w:rFonts w:ascii="Calibri" w:cs="Calibri" w:eastAsia="Calibri" w:hAnsi="Calibri"/>
-          <w:sz w:val="20"/>
-          <w:szCs w:val="20"/>
-        </w:rPr>
-        <w:t xml:space="preserve">Defined decision rights — what I can approve, and what comes to you first.</w:t>
-      </w:r>
-    </w:p>
-    <w:p>
-      <w:pPr>
-        <w:pStyle w:val="ListParagraph"/>
-        <w:numPr>
-          <w:ilvl w:val="0"/>
-          <w:numId w:val="2"/>
-        </w:numPr>
-        <w:spacing w:after="60"/>
-      </w:pPr>
-      <w:r>
-        <w:rPr>
-          <w:rFonts w:ascii="Calibri" w:cs="Calibri" w:eastAsia="Calibri" w:hAnsi="Calibri"/>
-          <w:sz w:val="20"/>
-          <w:szCs w:val="20"/>
-        </w:rPr>
-        <w:t xml:space="preserve">An introduction to my finance counterpart, and access to whatever facility-level reporting already exists.</w:t>
-      </w:r>
-    </w:p>
-    <w:p>
-      <w:pPr>
-        <w:pStyle w:val="ListParagraph"/>
-        <w:numPr>
-          <w:ilvl w:val="0"/>
-          <w:numId w:val="2"/>
-        </w:numPr>
-        <w:spacing w:after="60"/>
-      </w:pPr>
-      <w:r>
-        <w:rPr>
-          <w:rFonts w:ascii="Calibri" w:cs="Calibri" w:eastAsia="Calibri" w:hAnsi="Calibri"/>
-          <w:sz w:val="20"/>
-          <w:szCs w:val="20"/>
-        </w:rPr>
-        <w:t xml:space="preserve">Thirty days of questions before I propose changes.</w:t>
+        <w:t xml:space="preserve">Exit Criteria — When Baltimore Stops Being the Priority</w:t>
+      </w:r>
+    </w:p>
+    <w:p>
+      <w:pPr>
+        <w:spacing w:after="70" w:before="0"/>
+      </w:pPr>
+      <w:r>
+        <w:rPr>
+          <w:rFonts w:ascii="Calibri" w:cs="Calibri" w:eastAsia="Calibri" w:hAnsi="Calibri"/>
+          <w:sz w:val="20"/>
+          <w:szCs w:val="20"/>
+        </w:rPr>
+        <w:t xml:space="preserve">Widening scope should be a decision against evidence, not a calendar date. I would propose moving focus off Baltimore when:</w:t>
+      </w:r>
+    </w:p>
+    <w:p>
+      <w:pPr>
+        <w:pStyle w:val="ListParagraph"/>
+        <w:numPr>
+          <w:ilvl w:val="0"/>
+          <w:numId w:val="2"/>
+        </w:numPr>
+        <w:spacing w:after="60"/>
+      </w:pPr>
+      <w:r>
+        <w:rPr>
+          <w:rFonts w:ascii="Calibri" w:cs="Calibri" w:eastAsia="Calibri" w:hAnsi="Calibri"/>
+          <w:sz w:val="20"/>
+          <w:szCs w:val="20"/>
+        </w:rPr>
+        <w:t xml:space="preserve">On-time turnaround holds at or above target for two consecutive months, on the harmonized definition.</w:t>
+      </w:r>
+    </w:p>
+    <w:p>
+      <w:pPr>
+        <w:pStyle w:val="ListParagraph"/>
+        <w:numPr>
+          <w:ilvl w:val="0"/>
+          <w:numId w:val="2"/>
+        </w:numPr>
+        <w:spacing w:after="60"/>
+      </w:pPr>
+      <w:r>
+        <w:rPr>
+          <w:rFonts w:ascii="Calibri" w:cs="Calibri" w:eastAsia="Calibri" w:hAnsi="Calibri"/>
+          <w:sz w:val="20"/>
+          <w:szCs w:val="20"/>
+        </w:rPr>
+        <w:t xml:space="preserve">Backlog and aging sit within defined limits, with a stable trend rather than a rescued one.</w:t>
+      </w:r>
+    </w:p>
+    <w:p>
+      <w:pPr>
+        <w:pStyle w:val="ListParagraph"/>
+        <w:numPr>
+          <w:ilvl w:val="0"/>
+          <w:numId w:val="2"/>
+        </w:numPr>
+        <w:spacing w:after="60"/>
+      </w:pPr>
+      <w:r>
+        <w:rPr>
+          <w:rFonts w:ascii="Calibri" w:cs="Calibri" w:eastAsia="Calibri" w:hAnsi="Calibri"/>
+          <w:sz w:val="20"/>
+          <w:szCs w:val="20"/>
+        </w:rPr>
+        <w:t xml:space="preserve">Open corrective actions are closing faster than they open.</w:t>
+      </w:r>
+    </w:p>
+    <w:p>
+      <w:pPr>
+        <w:pStyle w:val="ListParagraph"/>
+        <w:numPr>
+          <w:ilvl w:val="0"/>
+          <w:numId w:val="2"/>
+        </w:numPr>
+        <w:spacing w:after="60"/>
+      </w:pPr>
+      <w:r>
+        <w:rPr>
+          <w:rFonts w:ascii="Calibri" w:cs="Calibri" w:eastAsia="Calibri" w:hAnsi="Calibri"/>
+          <w:b/>
+          <w:bCs/>
+          <w:sz w:val="20"/>
+          <w:szCs w:val="20"/>
+        </w:rPr>
+        <w:t xml:space="preserve">Site leadership produces the weekly metric set without me</w:t>
+      </w:r>
+      <w:r>
+        <w:rPr>
+          <w:rFonts w:ascii="Calibri" w:cs="Calibri" w:eastAsia="Calibri" w:hAnsi="Calibri"/>
+          <w:sz w:val="20"/>
+          <w:szCs w:val="20"/>
+        </w:rPr>
+        <w:t xml:space="preserve"> — the real test, because it means the cadence belongs to them.</w:t>
+      </w:r>
+    </w:p>
+    <w:p>
+      <w:pPr>
+        <w:pStyle w:val="ListParagraph"/>
+        <w:numPr>
+          <w:ilvl w:val="0"/>
+          <w:numId w:val="2"/>
+        </w:numPr>
+        <w:spacing w:after="60"/>
+      </w:pPr>
+      <w:r>
+        <w:rPr>
+          <w:rFonts w:ascii="Calibri" w:cs="Calibri" w:eastAsia="Calibri" w:hAnsi="Calibri"/>
+          <w:sz w:val="20"/>
+          <w:szCs w:val="20"/>
+        </w:rPr>
+        <w:t xml:space="preserve">One documented improvement has passed its effectiveness check.</w:t>
       </w:r>
     </w:p>
     <w:p>
@@ -657,6 +799,149 @@
           <w:sz w:val="21"/>
           <w:szCs w:val="21"/>
         </w:rPr>
+        <w:t xml:space="preserve">The First Year</w:t>
+      </w:r>
+    </w:p>
+    <w:p>
+      <w:pPr>
+        <w:spacing w:after="90" w:before="0"/>
+      </w:pPr>
+      <w:r>
+        <w:rPr>
+          <w:rFonts w:ascii="Calibri" w:cs="Calibri" w:eastAsia="Calibri" w:hAnsi="Calibri"/>
+          <w:sz w:val="20"/>
+          <w:szCs w:val="20"/>
+        </w:rPr>
+        <w:t xml:space="preserve">By the end of year one: every laboratory in the territory visited and characterized, the regional review running on common definitions, and </w:t>
+      </w:r>
+      <w:r>
+        <w:rPr>
+          <w:rFonts w:ascii="Calibri" w:cs="Calibri" w:eastAsia="Calibri" w:hAnsi="Calibri"/>
+          <w:b/>
+          <w:bCs/>
+          <w:sz w:val="20"/>
+          <w:szCs w:val="20"/>
+        </w:rPr>
+        <w:t xml:space="preserve">Baltimore and Richmond at steady state rather than in progress</w:t>
+      </w:r>
+      <w:r>
+        <w:rPr>
+          <w:rFonts w:ascii="Calibri" w:cs="Calibri" w:eastAsia="Calibri" w:hAnsi="Calibri"/>
+          <w:sz w:val="20"/>
+          <w:szCs w:val="20"/>
+        </w:rPr>
+        <w:t xml:space="preserve">. Those two are projects before they are sites — the rest of the territory gets added as they stabilize, not before.</w:t>
+      </w:r>
+    </w:p>
+    <w:p>
+      <w:pPr>
+        <w:pBdr>
+          <w:bottom w:val="single" w:color="999999" w:sz="6" w:space="2"/>
+        </w:pBdr>
+        <w:spacing w:after="90" w:before="200"/>
+      </w:pPr>
+      <w:r>
+        <w:rPr>
+          <w:rFonts w:ascii="Calibri" w:cs="Calibri" w:eastAsia="Calibri" w:hAnsi="Calibri"/>
+          <w:b/>
+          <w:bCs/>
+          <w:caps/>
+          <w:spacing w:val="30"/>
+          <w:sz w:val="21"/>
+          <w:szCs w:val="21"/>
+        </w:rPr>
+        <w:t xml:space="preserve">Inputs I Would Need</w:t>
+      </w:r>
+    </w:p>
+    <w:p>
+      <w:pPr>
+        <w:pStyle w:val="ListParagraph"/>
+        <w:numPr>
+          <w:ilvl w:val="0"/>
+          <w:numId w:val="2"/>
+        </w:numPr>
+        <w:spacing w:after="60"/>
+      </w:pPr>
+      <w:r>
+        <w:rPr>
+          <w:rFonts w:ascii="Calibri" w:cs="Calibri" w:eastAsia="Calibri" w:hAnsi="Calibri"/>
+          <w:sz w:val="20"/>
+          <w:szCs w:val="20"/>
+        </w:rPr>
+        <w:t xml:space="preserve">Which sites are in scope, and whether the P&amp;L is cut by site, by division, or by region.</w:t>
+      </w:r>
+    </w:p>
+    <w:p>
+      <w:pPr>
+        <w:pStyle w:val="ListParagraph"/>
+        <w:numPr>
+          <w:ilvl w:val="0"/>
+          <w:numId w:val="2"/>
+        </w:numPr>
+        <w:spacing w:after="60"/>
+      </w:pPr>
+      <w:r>
+        <w:rPr>
+          <w:rFonts w:ascii="Calibri" w:cs="Calibri" w:eastAsia="Calibri" w:hAnsi="Calibri"/>
+          <w:sz w:val="20"/>
+          <w:szCs w:val="20"/>
+        </w:rPr>
+        <w:t xml:space="preserve">Defined decision rights — what I can approve, and what comes to you first.</w:t>
+      </w:r>
+    </w:p>
+    <w:p>
+      <w:pPr>
+        <w:pStyle w:val="ListParagraph"/>
+        <w:numPr>
+          <w:ilvl w:val="0"/>
+          <w:numId w:val="2"/>
+        </w:numPr>
+        <w:spacing w:after="60"/>
+      </w:pPr>
+      <w:r>
+        <w:rPr>
+          <w:rFonts w:ascii="Calibri" w:cs="Calibri" w:eastAsia="Calibri" w:hAnsi="Calibri"/>
+          <w:sz w:val="20"/>
+          <w:szCs w:val="20"/>
+        </w:rPr>
+        <w:t xml:space="preserve">An introduction to my finance counterpart, and access to whatever facility-level reporting already exists.</w:t>
+      </w:r>
+    </w:p>
+    <w:p>
+      <w:pPr>
+        <w:pStyle w:val="ListParagraph"/>
+        <w:numPr>
+          <w:ilvl w:val="0"/>
+          <w:numId w:val="2"/>
+        </w:numPr>
+        <w:spacing w:after="60"/>
+      </w:pPr>
+      <w:r>
+        <w:rPr>
+          <w:rFonts w:ascii="Calibri" w:cs="Calibri" w:eastAsia="Calibri" w:hAnsi="Calibri"/>
+          <w:sz w:val="20"/>
+          <w:szCs w:val="20"/>
+        </w:rPr>
+        <w:t xml:space="preserve">Thirty days of questions before I propose changes.</w:t>
+      </w:r>
+    </w:p>
+    <w:p>
+      <w:pPr>
+        <w:pBdr>
+          <w:bottom w:val="single" w:color="999999" w:sz="6" w:space="2"/>
+        </w:pBdr>
+        <w:spacing w:after="90" w:before="200"/>
+      </w:pPr>
+      <w:r>
+        <w:rPr>
+          <w:rFonts w:ascii="Calibri" w:cs="Calibri" w:eastAsia="Calibri" w:hAnsi="Calibri"/>
+          <w:b/>
+          <w:bCs/>
+          <w:caps/>
+          <w:spacing w:val="30"/>
+          <w:sz w:val="21"/>
+          <w:szCs w:val="21"/>
+        </w:rPr>
         <w:t xml:space="preserve">Controls I Would Hold Myself To</w:t>
       </w:r>
     </w:p>
@@ -670,7 +955,7 @@
           <w:sz w:val="20"/>
           <w:szCs w:val="20"/>
         </w:rPr>
-        <w:t xml:space="preserve">No reorganization of a functioning team before the root cause is understood. No targets on measures that are not yet harmonized. And no trading defensible data for a faster month — a late result is recoverable, a result that does not hold up is not.</w:t>
+        <w:t xml:space="preserve">No reorganization of a functioning team before the root cause is understood. No targets on measures that are not yet harmonized. No new site added while Baltimore is still unstable. And no trading defensible data for a faster month — a late result is recoverable, a result that does not hold up is not.</w:t>
       </w:r>
     </w:p>
     <w:sectPr>
@@ -879,6 +1164,21 @@
   <w:style w:type="paragraph" w:styleId="Normal" w:default="1">
     <w:name w:val="Normal"/>
     <w:qFormat/>
+  </w:style>
+  <w:style w:type="table" w:styleId="TableNormal" w:default="true">
+    <w:name w:val="Normal Table"/>
+    <w:uiPriority w:val="99"/>
+    <w:semiHidden/>
+    <w:unhideWhenUsed/>
+    <w:tblPr>
+      <w:tblInd w:type="dxa" w:w="0"/>
+      <w:tblCellMar>
+        <w:top w:type="dxa" w:w="0"/>
+        <w:left w:type="dxa" w:w="108"/>
+        <w:bottom w:type="dxa" w:w="0"/>
+        <w:right w:type="dxa" w:w="108"/>
+      </w:tblCellMar>
+    </w:tblPr>
   </w:style>
   <w:style w:type="paragraph" w:styleId="Title">
     <w:name w:val="Title"/>

</xml_diff>